<commit_message>
Workspace root cleanup + flush pending working-tree files
Root cleanup (this session):
- Moved 22 Jira/GCP setup screenshots to archive/screenshots/
- Moved 9 protocol/module text scrapes to knowledge-base/
- Kept newer (2026-07-17) Book and Claim scrape in knowledge-base/,
  archived the 2026-06-30 one
- Moved Runbear Receipts/ to archive/; deleted .DS_Store + 2 stale
  Office lock files
- Emptied .playwright-mcp/ browser-download cache (261 MB)
- Regenerated pdd_full.txt (load-bearing for batch-qa-biochar's
  quote-verification) from the authoritative v1.12 PDD .docx into
  knowledge-base/; re-pointed build_checklist.py source paths;
  rebuilt + verified the biochar checklist template (46 cited rows)
- Updated README.txt and FOLDER_INDEX.md to match

Also flushes previously-pending working-tree files from earlier
sessions (.claude/_scratch, outputs/, settings) that were staged but
uncommitted before this session.

Co-Authored-By: Claude Opus 4.8 <noreply@anthropic.com>
</commit_message>
<xml_diff>
--- a/outputs/deliverables/isometric/Charm_Response_to_Isometric_Decoupling_Monitoring_from_Verification.docx
+++ b/outputs/deliverables/isometric/Charm_Response_to_Isometric_Decoupling_Monitoring_from_Verification.docx
@@ -186,7 +186,7 @@
         <w:pStyle w:val="ListBullet"/>
       </w:pPr>
       <w:r>
-        <w:t>Interaction with in-flight credit verifications: investigations run in parallel with in-flight credit verifications rather than freezing them. Credits already verified for prior reporting periods are unaffected unless the investigation specifically implicates the carbon stored in those periods.</w:t>
+        <w:t xml:space="preserve">Interaction with in-flight credit verifications: investigations run in parallel with in-flight credit verifications rather than freezing them. </w:t>
       </w:r>
     </w:p>
     <w:p>
@@ -194,7 +194,15 @@
         <w:pStyle w:val="ListBullet"/>
       </w:pPr>
       <w:r>
-        <w:t>Buffer pool draw mechanics: a buffer pool draw is triggered only on confirmed reversal at the close of the investigation, and is scoped to the demonstrably-affected stored mass — not project-wide. Calculation per the existing Isometric Standard mechanics.</w:t>
+        <w:t xml:space="preserve">Buffer pool </w:t>
+      </w:r>
+      <w:proofErr w:type="gramStart"/>
+      <w:r>
+        <w:t>draw</w:t>
+      </w:r>
+      <w:proofErr w:type="gramEnd"/>
+      <w:r>
+        <w:t xml:space="preserve"> mechanics: a buffer pool draw is triggered only on confirmed reversal at the close of the investigation.</w:t>
       </w:r>
     </w:p>
     <w:p>
@@ -258,7 +266,10 @@
         <w:pStyle w:val="ListBullet"/>
       </w:pPr>
       <w:r>
-        <w:t>VVB engagement: Charm's preference is that a single VVB engagement cover both credit and monitoring verifications, since the data sets share custody chains and a single engagement avoids bifurcation. Splitting may be workable if Isometric or the VVB has reason to prefer it; we'd flag it as a question that ultimately sits between Isometric and the VVB but with implications for Charm's documentation packaging.</w:t>
+        <w:t xml:space="preserve">VVB engagement: Charm's preference is that a single VVB engagement cover both credit and monitoring verifications, since the data sets share custody chains and a single engagement avoids bifurcation. </w:t>
+      </w:r>
+      <w:r>
+        <w:t>It also maintains the current VVB purview, which includes the review of monitoring data provided each Reporting Period.</w:t>
       </w:r>
     </w:p>
     <w:p>
@@ -272,12 +283,13 @@
     </w:p>
     <w:p>
       <w:r>
-        <w:t>Charm has already submitted monitoring data for the first quarter of 2026 at Basco under the existing per-RP regime. For a clean cut-over we would propose the first H1 2026 Monitoring Report cover Basco Q4 and Vaulted H1, leaving the Q1 2026 submission to stand on its own under the prior cadence rather than re-packaging it.</w:t>
+        <w:t xml:space="preserve">Charm has already submitted monitoring data for the first quarter of 2026 at Basco under the existing per-RP </w:t>
       </w:r>
-    </w:p>
-    <w:p>
       <w:r>
-        <w:t>We are flexible on the exact cut-over date, but would ask that it be settled before drafting the first Monitoring Report rather than after.</w:t>
+        <w:t>framework</w:t>
+      </w:r>
+      <w:r>
+        <w:t>. For a clean cut-over we would propose the first H1 2026 Monitoring Report cover Basco Q4 and Vaulted H1, leaving the Q1 2026 submission to stand on its own under the prior cadence rather than re-packaging it.</w:t>
       </w:r>
     </w:p>
     <w:p>
@@ -291,7 +303,7 @@
     </w:p>
     <w:p>
       <w:r>
-        <w:t>Our understanding is that this is intended as an operational agreement under the existing Bio-oil Geological Storage protocol rather than a protocol module version bump. That is workable for Charm and avoids the §2.4.5 protocol-adoption-at-renewal question. We would ask that the resolutions on each of the items above live in a single signed document with the same operational status as the existing SLA — written, dated, and referenceable — rather than living in email threads or in our respective notes.</w:t>
+        <w:t>Our understanding is that this is intended as an operational agreement under the existing Bio-oil Geological Storage protocol rather than a protocol module version bump. That is workable for Charm. We would ask that the resolutions on each of the items above live in a single signed document with the same operational status as the existing SLA — written, dated, and referenceable — rather than living in email threads or in our respective notes.</w:t>
       </w:r>
     </w:p>
     <w:p>
@@ -305,16 +317,16 @@
     </w:p>
     <w:p>
       <w:r>
-        <w:t xml:space="preserve">In addition to the items above, Charm believes this proposal presents a natural opportunity to act on a related ask from 350Solutions: extending the “tenure” of carbon intensities (CIs) for Charm-produced </w:t>
-      </w:r>
-      <w:r>
-        <w:lastRenderedPageBreak/>
-        <w:t>bio-oil and biochar would meaningfully reduce time-to-verify by stabilizing the EFs that the VVB validates each cycle, without changing the underlying quantification methodology.</w:t>
+        <w:t>In addition to the items above, Charm believes this proposal presents a natural opportunity to act on a related ask from 350Solutions: extending the “tenure” of carbon intensities (CIs) for Charm-produced bio-oil and biochar would meaningfully reduce time-to-verify by stabilizing the EFs that the VVB validates each cycle, without changing the underlying quantification methodology.</w:t>
       </w:r>
     </w:p>
     <w:p>
       <w:r>
-        <w:t>It is also worth noting that one month is an unusually short tenure for a CI in emissions quantification schemes generally. Most analogous frameworks (GREET-derived, GHG Protocol, GLEC, regulatory inventories) use semi-annual or annual tenures; AECN's process and embodied EFs are already on a half-yearly cadence within Charm's own scope. The current Charm-side monthly-to-bimonthly cadence is the outlier, not the norm.</w:t>
+        <w:t xml:space="preserve">It is also worth noting that one month is an unusually short tenure for a CI in emissions quantification schemes generally. Most analogous frameworks (GREET-derived, GHG Protocol, GLEC, regulatory </w:t>
+      </w:r>
+      <w:r>
+        <w:lastRenderedPageBreak/>
+        <w:t>inventories) use semi-annual or annual tenures; AECN's process and embodied EFs are already on a half-yearly cadence within Charm's own scope. The current Charm-side monthly-to-bimonthly cadence is the outlier, not the norm.</w:t>
       </w:r>
     </w:p>
     <w:p>
@@ -400,7 +412,13 @@
     </w:p>
     <w:p>
       <w:r>
-        <w:t>All three then run on a single H1 / H2 calendar, which is the underlying simplification this proposal is reaching for.</w:t>
+        <w:t xml:space="preserve">All three then run on a single H1 / H2 calendar, </w:t>
+      </w:r>
+      <w:r>
+        <w:t>optimizing</w:t>
+      </w:r>
+      <w:r>
+        <w:t xml:space="preserve"> the underlying simplification this proposal is reaching for.</w:t>
       </w:r>
     </w:p>
     <w:p>
@@ -428,37 +446,39 @@
     </w:p>
     <w:p>
       <w:r>
-        <w:t xml:space="preserve">If the above is acceptable as a basis for proceeding, Charm proposes the following path: (i) a working call to walk through the items in Sections 2 and 3, (ii) Isometric to circulate a draft of the operational </w:t>
+        <w:t xml:space="preserve">If the above is acceptable as a basis for proceeding, Charm proposes the following path: (i) a working call to walk through the items in Sections 2 and 3, </w:t>
       </w:r>
       <w:r>
-        <w:lastRenderedPageBreak/>
-        <w:t>agreement incorporating the resolutions, (iii) Charm to review and confirm. We would aim to have the agreement settled before the start of the first Monitoring Report period so that the cut-over is clean.</w:t>
+        <w:t xml:space="preserve">(ii) Socialize with Tim at 350 Solutions, </w:t>
+      </w:r>
+      <w:r>
+        <w:t>(</w:t>
+      </w:r>
+      <w:r>
+        <w:t>i</w:t>
+      </w:r>
+      <w:r>
+        <w:t>i</w:t>
+      </w:r>
+      <w:r>
+        <w:t>i</w:t>
+      </w:r>
+      <w:r>
+        <w:t xml:space="preserve">) Isometric to circulate a draft of the operational agreement incorporating the resolutions, (iii) Charm to review and confirm. We would aim to have the agreement settled </w:t>
+      </w:r>
+      <w:r>
+        <w:t xml:space="preserve">quickly </w:t>
+      </w:r>
+      <w:r>
+        <w:t>so that the cut-over is clean.</w:t>
       </w:r>
     </w:p>
     <w:p>
       <w:r>
-        <w:t>Happy to schedule the call at your convenience.</w:t>
+        <w:t>Please add any comments or questions to the doc directly. Otherwise, h</w:t>
       </w:r>
-    </w:p>
-    <w:p/>
-    <w:p>
       <w:r>
-        <w:t>Max Lavine</w:t>
-      </w:r>
-    </w:p>
-    <w:p>
-      <w:r>
-        <w:t>Carbon Protocol and Verification Lead</w:t>
-      </w:r>
-    </w:p>
-    <w:p>
-      <w:r>
-        <w:t>Charm Industrial</w:t>
-      </w:r>
-    </w:p>
-    <w:p>
-      <w:r>
-        <w:t>max@charmindustrial.com</w:t>
+        <w:t>appy to schedule the call at your convenience.</w:t>
       </w:r>
     </w:p>
     <w:sectPr>

</xml_diff>